<commit_message>
Deploy en Vercel: URL pública en documento final, docx regenerado, bitácora 24
- https://fmcn-prototipo.vercel.app verificado 12/12 con harness headless
- despliegue.md: estado actual Vercel; planes A/B quedan como alternativas
</commit_message>
<xml_diff>
--- a/docs/documento-final.docx
+++ b/docs/documento-final.docx
@@ -2,15 +2,7 @@
 <file path=word/document.xml><?xml version="1.0" encoding="utf-8"?>
 <w:document xmlns:w="http://schemas.openxmlformats.org/wordprocessingml/2006/main" xmlns:m="http://schemas.openxmlformats.org/officeDocument/2006/math" xmlns:r="http://schemas.openxmlformats.org/officeDocument/2006/relationships" xmlns:o="urn:schemas-microsoft-com:office:office" xmlns:v="urn:schemas-microsoft-com:vml" xmlns:w10="urn:schemas-microsoft-com:office:word" xmlns:a="http://schemas.openxmlformats.org/drawingml/2006/main" xmlns:pic="http://schemas.openxmlformats.org/drawingml/2006/picture" xmlns:wp="http://schemas.openxmlformats.org/drawingml/2006/wordprocessingDrawing">
   <w:body>
-    <w:p>
-      <w:pPr>
-        <w:pStyle w:val="Title"/>
-      </w:pPr>
-      <w:r>
-        <w:t xml:space="preserve">Priorización territorial de ANP federales — Prototipo FMCN</w:t>
-      </w:r>
-    </w:p>
-    <w:bookmarkStart w:id="13" w:name="Xd5d0a3ed496bd60527338b3f8411196212f8fc5"/>
+    <w:bookmarkStart w:id="24" w:name="Xd5d0a3ed496bd60527338b3f8411196212f8fc5"/>
     <w:p>
       <w:pPr>
         <w:pStyle w:val="Heading1"/>
@@ -34,33 +26,7 @@
         <w:t xml:space="preserve"> </w:t>
       </w:r>
       <w:r>
-        <w:rPr>
-          <w:i/>
-          <w:iCs/>
-        </w:rPr>
-        <w:t xml:space="preserve">(pendiente de deploy — ver docs/despliegue.md; mientras tanto:</w:t>
-      </w:r>
-      <w:r>
-        <w:rPr>
-          <w:i/>
-          <w:iCs/>
-        </w:rPr>
-        <w:t xml:space="preserve"> </w:t>
-      </w:r>
-      <w:r>
-        <w:rPr>
-          <w:rStyle w:val="VerbatimChar"/>
-          <w:i/>
-          <w:iCs/>
-        </w:rPr>
-        <w:t xml:space="preserve">cd web &amp;&amp; python -m http.server 8000</w:t>
-      </w:r>
-      <w:r>
-        <w:rPr>
-          <w:i/>
-          <w:iCs/>
-        </w:rPr>
-        <w:t xml:space="preserve">)</w:t>
+        <w:t xml:space="preserve">https://fmcn-prototipo.vercel.app</w:t>
       </w:r>
       <w:r>
         <w:t xml:space="preserve"> </w:t>
@@ -92,7 +58,7 @@
         <w:t xml:space="preserve"> </w:t>
       </w:r>
       <w:r>
-        <w:t xml:space="preserve">11 de junio de 2026</w:t>
+        <w:t xml:space="preserve">12 de junio de 2026</w:t>
       </w:r>
     </w:p>
     <w:p>
@@ -102,7 +68,7 @@
         </w:pict>
       </w:r>
     </w:p>
-    <w:bookmarkStart w:id="9" w:name="parte-1-problema-usuarios-y-datos"/>
+    <w:bookmarkStart w:id="20" w:name="parte-1-problema-usuarios-y-datos"/>
     <w:p>
       <w:pPr>
         <w:pStyle w:val="Heading2"/>
@@ -263,8 +229,8 @@
         <w:t xml:space="preserve">que cubren 98,000,719 ha. El prototipo y este documento usan 232.</w:t>
       </w:r>
     </w:p>
-    <w:bookmarkEnd w:id="9"/>
-    <w:bookmarkStart w:id="10" w:name="parte-3-arquitectura-e-implementación"/>
+    <w:bookmarkEnd w:id="20"/>
+    <w:bookmarkStart w:id="21" w:name="parte-3-arquitectura-e-implementación"/>
     <w:p>
       <w:pPr>
         <w:pStyle w:val="Heading2"/>
@@ -453,7 +419,7 @@
         <w:t xml:space="preserve"> </w:t>
       </w:r>
       <w:r>
-        <w:t xml:space="preserve">Fase 1 (actual): hosting estático en Cloudflare Pages, ~$0–50 USD/mes. Fase 2, si crecen capas y usuarios: PostGIS + tileserver en un VPS (~$80–150 USD/mes), autenticación y roles. La actualización semestral de capas reutiliza el pipeline existente (~4 h por ciclo). Operación: un perfil técnico medio a tiempo parcial con soporte puntual de consultoría. El presupuesto de $300,000 MXN alcanza holgado: el grueso va a</w:t>
+        <w:t xml:space="preserve">Fase 1 (actual): hosting estático en Vercel — desplegado, con repo privado y deploy automático por Git — ~$0–50 USD/mes. Fase 2, si crecen capas y usuarios: PostGIS + tileserver en un VPS (~$80–150 USD/mes), autenticación y roles. La actualización semestral de capas reutiliza el pipeline existente (~4 h por ciclo). Operación: un perfil técnico medio a tiempo parcial con soporte puntual de consultoría. El presupuesto de $300,000 MXN alcanza holgado: el grueso va a</w:t>
       </w:r>
       <w:r>
         <w:t xml:space="preserve"> </w:t>
@@ -520,8 +486,8 @@
         <w:t xml:space="preserve">Pesos del índice ilustrativos; sin autenticación en el prototipo; datos a fecha de corte, no en tiempo real; la simplificación de geometrías sacrifica precisión de bordes; una sola capa de cruce socioeconómico. En el modo demo (servicio REST en vivo) la capa ANP es la versión 2020 (182 ANP) y el cruce ANP–municipio se hace por nombre, una aproximación; el pipeline con el shapefile de septiembre 2024 produce el join espacial exacto con las 232 ANP y datos CONAPO 2020.</w:t>
       </w:r>
     </w:p>
-    <w:bookmarkEnd w:id="10"/>
-    <w:bookmarkStart w:id="11" w:name="parte-4-ciberseguridad"/>
+    <w:bookmarkEnd w:id="21"/>
+    <w:bookmarkStart w:id="22" w:name="parte-4-ciberseguridad"/>
     <w:p>
       <w:pPr>
         <w:pStyle w:val="Heading2"/>
@@ -608,8 +574,8 @@
         <w:t xml:space="preserve">.</w:t>
       </w:r>
     </w:p>
-    <w:bookmarkEnd w:id="11"/>
-    <w:bookmarkStart w:id="12" w:name="parte-5-bitácora-de-uso-de-ia"/>
+    <w:bookmarkEnd w:id="22"/>
+    <w:bookmarkStart w:id="23" w:name="parte-5-bitácora-de-uso-de-ia"/>
     <w:p>
       <w:pPr>
         <w:pStyle w:val="Heading2"/>
@@ -633,7 +599,7 @@
         <w:t xml:space="preserve"> </w:t>
       </w:r>
       <w:r>
-        <w:t xml:space="preserve">Claude (Cowork desktop) como asistente principal de análisis, código y redacción; Python 3 + geopandas (pipeline); MapLibre GL JS 4.7 (visor); Cloudflare Pages (hosting). Registro completo en</w:t>
+        <w:t xml:space="preserve">Claude (Cowork desktop) como asistente principal de análisis, código y redacción; Python 3 + geopandas (pipeline); MapLibre GL JS 4.7 (visor); Vercel (hosting). Registro completo en</w:t>
       </w:r>
       <w:r>
         <w:t xml:space="preserve"> </w:t>
@@ -818,8 +784,8 @@
         <w:t xml:space="preserve">toda cifra contra fuente primaria; todo código probado antes de integrarse; la IA acelera, el criterio humano valida.</w:t>
       </w:r>
     </w:p>
-    <w:bookmarkEnd w:id="12"/>
-    <w:bookmarkEnd w:id="13"/>
+    <w:bookmarkEnd w:id="23"/>
+    <w:bookmarkEnd w:id="24"/>
     <w:sectPr>
       <w:footnotePr>
         <w:numRestart w:val="eachSect"/>
@@ -1056,10 +1022,10 @@
   <w:docDefaults>
     <w:rPrDefault>
       <w:rPr>
-        <w:rFonts w:asciiTheme="minorHAnsi" w:cstheme="minorBidi" w:eastAsiaTheme="minorEastAsia" w:hAnsiTheme="minorHAnsi"/>
+        <w:rFonts w:asciiTheme="minorHAnsi" w:cstheme="minorBidi" w:eastAsiaTheme="minorHAnsi" w:hAnsiTheme="minorHAnsi"/>
         <w:sz w:val="24"/>
         <w:szCs w:val="24"/>
-        <w:lang w:bidi="ar-SA" w:eastAsia="zh-CN" w:val="en-US"/>
+        <w:lang w:bidi="ar-SA" w:eastAsia="en-US" w:val="en-US"/>
       </w:rPr>
     </w:rPrDefault>
     <w:pPrDefault>
@@ -1600,6 +1566,13 @@
       </w:tblCellMar>
     </w:tblPr>
     <w:tblStylePr w:type="firstRow">
+      <w:tblPr>
+        <w:jc w:val="left"/>
+        <w:tblInd w:type="dxa" w:w="0"/>
+      </w:tblPr>
+      <w:trPr>
+        <w:jc w:val="left"/>
+      </w:trPr>
       <w:tcPr>
         <w:tcBorders>
           <w:bottom w:val="single"/>

</xml_diff>